<commit_message>
Ship Holberton mandatory auth: email/SMS verify and customer password change.
Register issues a hashed 6-digit code (classroom demo_code, optional SMTP).
Login stays blocked until /auth/verify. Customers change their password from
the account page; forgot-password uses the same code flow. 92 tests OK.

Co-authored-by: Issercio <Issercio@users.noreply.github.com>
</commit_message>
<xml_diff>
--- a/docs/Pivoine-Lilas-Specifications.docx
+++ b/docs/Pivoine-Lilas-Specifications.docx
@@ -860,7 +860,7 @@
           <w:color w:val="3A2A30"/>
           <w:sz w:val="22"/>
         </w:rPr>
-        <w:t>Realistic first version (MVP): accounts (JWT), catalog with photos, cart isolation, checkout, 30 % deposit, subscriptions, order tracking, admin CRUD + photo upload + vitrine + invoices, local HTTPS + FORCE_HTTPS, CNIL login lockout. Not in MVP: click-and-collect slots, delivery zones, email, homepage CMS, live Stripe, legal HT/TVA split, customer password-change form, email/SMS verification.</w:t>
+        <w:t>Realistic first version (MVP): accounts (JWT), catalog with photos, cart isolation, checkout, 30 % deposit, subscriptions, order tracking, admin CRUD + photo upload + vitrine + invoices, local HTTPS + FORCE_HTTPS, CNIL login lockout, email/SMS verification, customer password change. Not in MVP: click-and-collect slots, delivery zones, homepage CMS, live Stripe, legal HT/TVA split.</w:t>
       </w:r>
     </w:p>
     <w:p>
@@ -1063,7 +1063,7 @@
           <w:color w:val="3A2A30"/>
           <w:sz w:val="22"/>
         </w:rPr>
-        <w:t>Swagger at /api/v1, Postman collection, ./run-tests.sh (86 tests).</w:t>
+        <w:t>Swagger at /api/v1, Postman collection, ./run-tests.sh (92 tests).</w:t>
       </w:r>
     </w:p>
     <w:p>
@@ -1142,7 +1142,7 @@
           <w:color w:val="3A2A30"/>
           <w:sz w:val="22"/>
         </w:rPr>
-        <w:t>Customer password-change form (admin PUT /users/&lt;id&gt; can hash a new password).</w:t>
+        <w:t>Transactional email receipts — verification/reset use a 6-digit code (SMTP if MAIL_SERVER is set; classroom demo_code).</w:t>
       </w:r>
     </w:p>
     <w:p>
@@ -2225,7 +2225,7 @@
           <w:color w:val="3A2A30"/>
           <w:sz w:val="22"/>
         </w:rPr>
-        <w:t>./run-tests.sh reports 86 tests OK (accounts, admin guards, checkout, vitrine, IDOR, HTTPS redirect, CNIL lockout).</w:t>
+        <w:t>./run-tests.sh reports 92 tests OK (accounts, admin guards, checkout, vitrine, IDOR, HTTPS redirect, CNIL lockout).</w:t>
       </w:r>
     </w:p>
     <w:p>
@@ -2682,7 +2682,7 @@
                 <w:color w:val="3A2A30"/>
                 <w:sz w:val="20"/>
               </w:rPr>
-              <w:t>Should Have</w:t>
+              <w:t>Must Have</w:t>
             </w:r>
           </w:p>
         </w:tc>
@@ -2700,7 +2700,7 @@
                 <w:color w:val="3A2A30"/>
                 <w:sz w:val="20"/>
               </w:rPr>
-              <w:t>Floral subscriptions as catalog SKUs</w:t>
+              <w:t>Email/SMS account verification (6-digit code)</w:t>
             </w:r>
           </w:p>
         </w:tc>
@@ -2721,7 +2721,7 @@
                 <w:color w:val="3A2A30"/>
                 <w:sz w:val="20"/>
               </w:rPr>
-              <w:t>Should Have</w:t>
+              <w:t>Must Have</w:t>
             </w:r>
           </w:p>
         </w:tc>
@@ -2740,7 +2740,7 @@
                 <w:color w:val="3A2A30"/>
                 <w:sz w:val="20"/>
               </w:rPr>
-              <w:t>30 % deposit + settle remaining</w:t>
+              <w:t>Customer password change + forgot/reset</w:t>
             </w:r>
           </w:p>
         </w:tc>
@@ -2778,7 +2778,7 @@
                 <w:color w:val="3A2A30"/>
                 <w:sz w:val="20"/>
               </w:rPr>
-              <w:t>Customer order tracking</w:t>
+              <w:t>Floral subscriptions as catalog SKUs</w:t>
             </w:r>
           </w:p>
         </w:tc>
@@ -2818,7 +2818,7 @@
                 <w:color w:val="3A2A30"/>
                 <w:sz w:val="20"/>
               </w:rPr>
-              <w:t>Min/max price + colour + name filters</w:t>
+              <w:t>30 % deposit + settle remaining</w:t>
             </w:r>
           </w:p>
         </w:tc>
@@ -2838,7 +2838,7 @@
                 <w:color w:val="3A2A30"/>
                 <w:sz w:val="20"/>
               </w:rPr>
-              <w:t>Could Have</w:t>
+              <w:t>Should Have</w:t>
             </w:r>
           </w:p>
         </w:tc>
@@ -2856,7 +2856,7 @@
                 <w:color w:val="3A2A30"/>
                 <w:sz w:val="20"/>
               </w:rPr>
-              <w:t>Season/event vitrine combos</w:t>
+              <w:t>Customer order tracking</w:t>
             </w:r>
           </w:p>
         </w:tc>
@@ -2877,7 +2877,7 @@
                 <w:color w:val="3A2A30"/>
                 <w:sz w:val="20"/>
               </w:rPr>
-              <w:t>Could Have</w:t>
+              <w:t>Should Have</w:t>
             </w:r>
           </w:p>
         </w:tc>
@@ -2896,7 +2896,7 @@
                 <w:color w:val="3A2A30"/>
                 <w:sz w:val="20"/>
               </w:rPr>
-              <w:t>Custom event themes create/delete</w:t>
+              <w:t>Min/max price + colour + name filters</w:t>
             </w:r>
           </w:p>
         </w:tc>
@@ -2934,7 +2934,7 @@
                 <w:color w:val="3A2A30"/>
                 <w:sz w:val="20"/>
               </w:rPr>
-              <w:t>Optional Stripe PI + webhook</w:t>
+              <w:t>Season/event vitrine combos</w:t>
             </w:r>
           </w:p>
         </w:tc>
@@ -2974,7 +2974,7 @@
                 <w:color w:val="3A2A30"/>
                 <w:sz w:val="20"/>
               </w:rPr>
-              <w:t>Print invoice window</w:t>
+              <w:t>Custom event themes create/delete</w:t>
             </w:r>
           </w:p>
         </w:tc>
@@ -2994,6 +2994,84 @@
                 <w:color w:val="3A2A30"/>
                 <w:sz w:val="20"/>
               </w:rPr>
+              <w:t>Could Have</w:t>
+            </w:r>
+          </w:p>
+        </w:tc>
+        <w:tc>
+          <w:tcPr>
+            <w:tcW w:type="dxa" w:w="4986"/>
+          </w:tcPr>
+          <w:p>
+            <w:r/>
+            <w:r>
+              <w:rPr>
+                <w:rFonts w:ascii="Arial" w:hAnsi="Arial" w:cs="Arial"/>
+                <w:b w:val="0"/>
+                <w:i w:val="0"/>
+                <w:color w:val="3A2A30"/>
+                <w:sz w:val="20"/>
+              </w:rPr>
+              <w:t>Optional Stripe PI + webhook</w:t>
+            </w:r>
+          </w:p>
+        </w:tc>
+      </w:tr>
+      <w:tr>
+        <w:tc>
+          <w:tcPr>
+            <w:tcW w:type="dxa" w:w="4986"/>
+            <w:shd w:fill="F8F5F2" w:val="clear"/>
+          </w:tcPr>
+          <w:p>
+            <w:r/>
+            <w:r>
+              <w:rPr>
+                <w:rFonts w:ascii="Arial" w:hAnsi="Arial" w:cs="Arial"/>
+                <w:b w:val="0"/>
+                <w:i w:val="0"/>
+                <w:color w:val="3A2A30"/>
+                <w:sz w:val="20"/>
+              </w:rPr>
+              <w:t>Could Have</w:t>
+            </w:r>
+          </w:p>
+        </w:tc>
+        <w:tc>
+          <w:tcPr>
+            <w:tcW w:type="dxa" w:w="4986"/>
+            <w:shd w:fill="F8F5F2" w:val="clear"/>
+          </w:tcPr>
+          <w:p>
+            <w:r/>
+            <w:r>
+              <w:rPr>
+                <w:rFonts w:ascii="Arial" w:hAnsi="Arial" w:cs="Arial"/>
+                <w:b w:val="0"/>
+                <w:i w:val="0"/>
+                <w:color w:val="3A2A30"/>
+                <w:sz w:val="20"/>
+              </w:rPr>
+              <w:t>Print invoice window</w:t>
+            </w:r>
+          </w:p>
+        </w:tc>
+      </w:tr>
+      <w:tr>
+        <w:tc>
+          <w:tcPr>
+            <w:tcW w:type="dxa" w:w="4986"/>
+          </w:tcPr>
+          <w:p>
+            <w:r/>
+            <w:r>
+              <w:rPr>
+                <w:rFonts w:ascii="Arial" w:hAnsi="Arial" w:cs="Arial"/>
+                <w:b w:val="0"/>
+                <w:i w:val="0"/>
+                <w:color w:val="3A2A30"/>
+                <w:sz w:val="20"/>
+              </w:rPr>
               <w:t>Won’t Have now</w:t>
             </w:r>
           </w:p>
@@ -3012,7 +3090,7 @@
                 <w:color w:val="3A2A30"/>
                 <w:sz w:val="20"/>
               </w:rPr>
-              <w:t>Email verification / reset mail, customer password-change form, click-and-collect, geo zones, HT/TVA, native app, chat, AI, 2FA, reviews UI</w:t>
+              <w:t>Click-and-collect, geo zones, HT/TVA, native app, chat, AI, 2FA, reviews UI</w:t>
             </w:r>
           </w:p>
         </w:tc>
@@ -4649,7 +4727,7 @@
                 <w:color w:val="3A2A30"/>
                 <w:sz w:val="20"/>
               </w:rPr>
-              <w:t>Not shipped</w:t>
+              <w:t>Done</w:t>
             </w:r>
           </w:p>
         </w:tc>
@@ -4668,7 +4746,7 @@
                 <w:color w:val="3A2A30"/>
                 <w:sz w:val="20"/>
               </w:rPr>
-              <w:t>verify-code.html is UI only — listed as missing</w:t>
+              <w:t>POST /auth/verify + /verify-code.html (email or SMS, classroom demo_code)</w:t>
             </w:r>
           </w:p>
         </w:tc>
@@ -4706,7 +4784,7 @@
                 <w:color w:val="3A2A30"/>
                 <w:sz w:val="20"/>
               </w:rPr>
-              <w:t>Partial</w:t>
+              <w:t>Done</w:t>
             </w:r>
           </w:p>
         </w:tc>
@@ -4724,7 +4802,7 @@
                 <w:color w:val="3A2A30"/>
                 <w:sz w:val="20"/>
               </w:rPr>
-              <w:t>PUT /users/&lt;id&gt; hashes password but is admin-only; no customer password-change form</w:t>
+              <w:t>POST /auth/change-password from /account.html; forgot/reset with 6-digit code</w:t>
             </w:r>
           </w:p>
         </w:tc>
@@ -8255,7 +8333,7 @@
           <w:color w:val="3A2A30"/>
           <w:sz w:val="22"/>
         </w:rPr>
-        <w:t>Unit/integration via Flask test_client + in-memory SQLite. Critical paths: auth hashing, roles, checkout money, IDOR, vitrine, uploads, HTTPS redirect, CNIL lockout. Manual table in docs/testing.md (M1–M10). No Playwright yet. Evidence: docs/test-evidence/, 86 tests OK. Bugs found (empty cart, bcrypt Marie, shared cart, float money, forged JWT, season picker on home, sparse admin orders) are fixed and listed. Open: no email, no customer password-change form, reviews unmounted, localStorage cart, leftover modules lowering package coverage.</w:t>
+        <w:t>Unit/integration via Flask test_client + in-memory SQLite. Critical paths: auth hashing, roles, checkout money, IDOR, vitrine, uploads, HTTPS redirect, CNIL lockout, email/SMS verify, password change. Manual table in docs/testing.md (M1–M10). No Playwright yet. Evidence: docs/test-evidence/, 92 tests OK. Bugs found (empty cart, bcrypt Marie, shared cart, float money, forged JWT, season picker on home, sparse admin orders) are fixed and listed. Open: reviews unmounted, localStorage cart, leftover modules lowering package coverage, no public production host.</w:t>
       </w:r>
     </w:p>
     <w:p>
@@ -10167,7 +10245,7 @@
                 <w:color w:val="3A2A30"/>
                 <w:sz w:val="20"/>
               </w:rPr>
-              <w:t>Email verification</w:t>
+              <w:t>Email / SMS verification</w:t>
             </w:r>
           </w:p>
         </w:tc>
@@ -10203,7 +10281,7 @@
                 <w:color w:val="3A2A30"/>
                 <w:sz w:val="20"/>
               </w:rPr>
-              <w:t>—</w:t>
+              <w:t>Dimitri</w:t>
             </w:r>
           </w:p>
         </w:tc>
@@ -10221,7 +10299,7 @@
                 <w:color w:val="3A2A30"/>
                 <w:sz w:val="20"/>
               </w:rPr>
-              <w:t>Mandatory list</w:t>
+              <w:t>Must</w:t>
             </w:r>
           </w:p>
         </w:tc>
@@ -10239,7 +10317,104 @@
                 <w:color w:val="3A2A30"/>
                 <w:sz w:val="20"/>
               </w:rPr>
-              <w:t>Won’t this demo</w:t>
+              <w:t>Done</w:t>
+            </w:r>
+          </w:p>
+        </w:tc>
+      </w:tr>
+      <w:tr>
+        <w:tc>
+          <w:tcPr>
+            <w:tcW w:type="dxa" w:w="1994"/>
+            <w:shd w:fill="F8F5F2" w:val="clear"/>
+          </w:tcPr>
+          <w:p>
+            <w:r/>
+            <w:r>
+              <w:rPr>
+                <w:rFonts w:ascii="Arial" w:hAnsi="Arial" w:cs="Arial"/>
+                <w:b w:val="0"/>
+                <w:i w:val="0"/>
+                <w:color w:val="3A2A30"/>
+                <w:sz w:val="20"/>
+              </w:rPr>
+              <w:t>Customer password change</w:t>
+            </w:r>
+          </w:p>
+        </w:tc>
+        <w:tc>
+          <w:tcPr>
+            <w:tcW w:type="dxa" w:w="1994"/>
+            <w:shd w:fill="F8F5F2" w:val="clear"/>
+          </w:tcPr>
+          <w:p>
+            <w:r/>
+            <w:r>
+              <w:rPr>
+                <w:rFonts w:ascii="Arial" w:hAnsi="Arial" w:cs="Arial"/>
+                <w:b w:val="0"/>
+                <w:i w:val="0"/>
+                <w:color w:val="3A2A30"/>
+                <w:sz w:val="20"/>
+              </w:rPr>
+              <w:t>Story</w:t>
+            </w:r>
+          </w:p>
+        </w:tc>
+        <w:tc>
+          <w:tcPr>
+            <w:tcW w:type="dxa" w:w="1994"/>
+            <w:shd w:fill="F8F5F2" w:val="clear"/>
+          </w:tcPr>
+          <w:p>
+            <w:r/>
+            <w:r>
+              <w:rPr>
+                <w:rFonts w:ascii="Arial" w:hAnsi="Arial" w:cs="Arial"/>
+                <w:b w:val="0"/>
+                <w:i w:val="0"/>
+                <w:color w:val="3A2A30"/>
+                <w:sz w:val="20"/>
+              </w:rPr>
+              <w:t>Dimitri</w:t>
+            </w:r>
+          </w:p>
+        </w:tc>
+        <w:tc>
+          <w:tcPr>
+            <w:tcW w:type="dxa" w:w="1994"/>
+            <w:shd w:fill="F8F5F2" w:val="clear"/>
+          </w:tcPr>
+          <w:p>
+            <w:r/>
+            <w:r>
+              <w:rPr>
+                <w:rFonts w:ascii="Arial" w:hAnsi="Arial" w:cs="Arial"/>
+                <w:b w:val="0"/>
+                <w:i w:val="0"/>
+                <w:color w:val="3A2A30"/>
+                <w:sz w:val="20"/>
+              </w:rPr>
+              <w:t>Must</w:t>
+            </w:r>
+          </w:p>
+        </w:tc>
+        <w:tc>
+          <w:tcPr>
+            <w:tcW w:type="dxa" w:w="1994"/>
+            <w:shd w:fill="F8F5F2" w:val="clear"/>
+          </w:tcPr>
+          <w:p>
+            <w:r/>
+            <w:r>
+              <w:rPr>
+                <w:rFonts w:ascii="Arial" w:hAnsi="Arial" w:cs="Arial"/>
+                <w:b w:val="0"/>
+                <w:i w:val="0"/>
+                <w:color w:val="3A2A30"/>
+                <w:sz w:val="20"/>
+              </w:rPr>
+              <w:t>Done</w:t>
             </w:r>
           </w:p>
         </w:tc>
@@ -10689,7 +10864,7 @@
           <w:color w:val="3A2A30"/>
           <w:sz w:val="22"/>
         </w:rPr>
-        <w:t>Pivoine &amp; Lilas is a florist shop that takes a real order after closing time. The specification, the README, and the deck match the shipped MVP: JWT shop, Decimal checkout, vitrine, tracking, printable TTC invoices, local HTTPS, CNIL lockout, 86 tests. Cuts (email verification, customer password-change form, geo, HT/TVA, homepage CMS) are explicit. The next work is operations, not another visual pass.</w:t>
+        <w:t>Pivoine &amp; Lilas is a florist shop that takes a real order after closing time. The specification, the README, and the deck match the shipped MVP: JWT shop, Decimal checkout, vitrine, tracking, printable TTC invoices, local HTTPS, CNIL lockout, email/SMS verification, customer password change, 92 tests. Cuts (geo, HT/TVA, homepage CMS) are explicit. The next work is operations, not another visual pass.</w:t>
       </w:r>
     </w:p>
     <w:sectPr>

</xml_diff>

<commit_message>
Document a 50/50 split: Dimitri backend, Mattieu frontend and database.
The specification (and the team slide) now state Dimitri owns the entire
Flask API and Mattieu owns the entire storefront plus the data model.

Co-authored-by: Issercio <Issercio@users.noreply.github.com>
</commit_message>
<xml_diff>
--- a/docs/Pivoine-Lilas-Specifications.docx
+++ b/docs/Pivoine-Lilas-Specifications.docx
@@ -143,14 +143,15 @@
         <w:tblLook w:firstColumn="1" w:firstRow="1" w:lastColumn="0" w:lastRow="0" w:noHBand="0" w:noVBand="1" w:val="04A0"/>
       </w:tblPr>
       <w:tblGrid>
-        <w:gridCol w:w="3324"/>
-        <w:gridCol w:w="3324"/>
-        <w:gridCol w:w="3324"/>
+        <w:gridCol w:w="2493"/>
+        <w:gridCol w:w="2493"/>
+        <w:gridCol w:w="2493"/>
+        <w:gridCol w:w="2493"/>
       </w:tblGrid>
       <w:tr>
         <w:tc>
           <w:tcPr>
-            <w:tcW w:type="dxa" w:w="3324"/>
+            <w:tcW w:type="dxa" w:w="2493"/>
             <w:shd w:fill="BC6288" w:val="clear"/>
           </w:tcPr>
           <w:p>
@@ -169,7 +170,7 @@
         </w:tc>
         <w:tc>
           <w:tcPr>
-            <w:tcW w:type="dxa" w:w="3324"/>
+            <w:tcW w:type="dxa" w:w="2493"/>
             <w:shd w:fill="BC6288" w:val="clear"/>
           </w:tcPr>
           <w:p>
@@ -182,13 +183,32 @@
                 <w:color w:val="FFFFFF"/>
                 <w:sz w:val="20"/>
               </w:rPr>
+              <w:t>Share</w:t>
+            </w:r>
+          </w:p>
+        </w:tc>
+        <w:tc>
+          <w:tcPr>
+            <w:tcW w:type="dxa" w:w="2493"/>
+            <w:shd w:fill="BC6288" w:val="clear"/>
+          </w:tcPr>
+          <w:p>
+            <w:r/>
+            <w:r>
+              <w:rPr>
+                <w:rFonts w:ascii="Arial" w:hAnsi="Arial" w:cs="Arial"/>
+                <w:b/>
+                <w:i w:val="0"/>
+                <w:color w:val="FFFFFF"/>
+                <w:sz w:val="20"/>
+              </w:rPr>
               <w:t>Role</w:t>
             </w:r>
           </w:p>
         </w:tc>
         <w:tc>
           <w:tcPr>
-            <w:tcW w:type="dxa" w:w="3324"/>
+            <w:tcW w:type="dxa" w:w="2493"/>
             <w:shd w:fill="BC6288" w:val="clear"/>
           </w:tcPr>
           <w:p>
@@ -209,7 +229,7 @@
       <w:tr>
         <w:tc>
           <w:tcPr>
-            <w:tcW w:type="dxa" w:w="3324"/>
+            <w:tcW w:type="dxa" w:w="2493"/>
           </w:tcPr>
           <w:p>
             <w:r/>
@@ -227,37 +247,55 @@
         </w:tc>
         <w:tc>
           <w:tcPr>
-            <w:tcW w:type="dxa" w:w="3324"/>
-          </w:tcPr>
-          <w:p>
-            <w:r/>
-            <w:r>
-              <w:rPr>
-                <w:rFonts w:ascii="Arial" w:hAnsi="Arial" w:cs="Arial"/>
-                <w:b w:val="0"/>
-                <w:i w:val="0"/>
-                <w:color w:val="3A2A30"/>
-                <w:sz w:val="20"/>
-              </w:rPr>
-              <w:t>Backend lead &amp; full-stack</w:t>
-            </w:r>
-          </w:p>
-        </w:tc>
-        <w:tc>
-          <w:tcPr>
-            <w:tcW w:type="dxa" w:w="3324"/>
-          </w:tcPr>
-          <w:p>
-            <w:r/>
-            <w:r>
-              <w:rPr>
-                <w:rFonts w:ascii="Arial" w:hAnsi="Arial" w:cs="Arial"/>
-                <w:b w:val="0"/>
-                <w:i w:val="0"/>
-                <w:color w:val="3A2A30"/>
-                <w:sz w:val="20"/>
-              </w:rPr>
-              <w:t>Flask API, SQLAlchemy models, JWT auth, checkout (Decimal prices, test cards, optional Stripe), admin guards, tests, HTTPS, CNIL lockout, README and this specification.</w:t>
+            <w:tcW w:type="dxa" w:w="2493"/>
+          </w:tcPr>
+          <w:p>
+            <w:r/>
+            <w:r>
+              <w:rPr>
+                <w:rFonts w:ascii="Arial" w:hAnsi="Arial" w:cs="Arial"/>
+                <w:b w:val="0"/>
+                <w:i w:val="0"/>
+                <w:color w:val="3A2A30"/>
+                <w:sz w:val="20"/>
+              </w:rPr>
+              <w:t>50 %</w:t>
+            </w:r>
+          </w:p>
+        </w:tc>
+        <w:tc>
+          <w:tcPr>
+            <w:tcW w:type="dxa" w:w="2493"/>
+          </w:tcPr>
+          <w:p>
+            <w:r/>
+            <w:r>
+              <w:rPr>
+                <w:rFonts w:ascii="Arial" w:hAnsi="Arial" w:cs="Arial"/>
+                <w:b w:val="0"/>
+                <w:i w:val="0"/>
+                <w:color w:val="3A2A30"/>
+                <w:sz w:val="20"/>
+              </w:rPr>
+              <w:t>Backend (all of it)</w:t>
+            </w:r>
+          </w:p>
+        </w:tc>
+        <w:tc>
+          <w:tcPr>
+            <w:tcW w:type="dxa" w:w="2493"/>
+          </w:tcPr>
+          <w:p>
+            <w:r/>
+            <w:r>
+              <w:rPr>
+                <w:rFonts w:ascii="Arial" w:hAnsi="Arial" w:cs="Arial"/>
+                <w:b w:val="0"/>
+                <w:i w:val="0"/>
+                <w:color w:val="3A2A30"/>
+                <w:sz w:val="20"/>
+              </w:rPr>
+              <w:t>Entire server: Flask, REST /api/v1, JWT, checkout (Decimal, test cards, optional Stripe), admin guards, HTTPS, CNIL lockout, verification/reset APIs, tests, security. No frontend templates/CSS/JS. No database models or schema.</w:t>
             </w:r>
           </w:p>
         </w:tc>
@@ -265,7 +303,7 @@
       <w:tr>
         <w:tc>
           <w:tcPr>
-            <w:tcW w:type="dxa" w:w="3324"/>
+            <w:tcW w:type="dxa" w:w="2493"/>
             <w:shd w:fill="F8F5F2" w:val="clear"/>
           </w:tcPr>
           <w:p>
@@ -284,7 +322,7 @@
         </w:tc>
         <w:tc>
           <w:tcPr>
-            <w:tcW w:type="dxa" w:w="3324"/>
+            <w:tcW w:type="dxa" w:w="2493"/>
             <w:shd w:fill="F8F5F2" w:val="clear"/>
           </w:tcPr>
           <w:p>
@@ -297,13 +335,13 @@
                 <w:color w:val="3A2A30"/>
                 <w:sz w:val="20"/>
               </w:rPr>
-              <w:t>Frontend, product &amp; Demo Day</w:t>
-            </w:r>
-          </w:p>
-        </w:tc>
-        <w:tc>
-          <w:tcPr>
-            <w:tcW w:type="dxa" w:w="3324"/>
+              <w:t>50 %</w:t>
+            </w:r>
+          </w:p>
+        </w:tc>
+        <w:tc>
+          <w:tcPr>
+            <w:tcW w:type="dxa" w:w="2493"/>
             <w:shd w:fill="F8F5F2" w:val="clear"/>
           </w:tcPr>
           <w:p>
@@ -316,13 +354,47 @@
                 <w:color w:val="3A2A30"/>
                 <w:sz w:val="20"/>
               </w:rPr>
-              <w:t>Jinja/CSS/JS storefront, user stories, mockups/screens, live demonstration, presentation deck, CGV and merchant copy.</w:t>
+              <w:t>Frontend (all of it) + database (all of it)</w:t>
+            </w:r>
+          </w:p>
+        </w:tc>
+        <w:tc>
+          <w:tcPr>
+            <w:tcW w:type="dxa" w:w="2493"/>
+            <w:shd w:fill="F8F5F2" w:val="clear"/>
+          </w:tcPr>
+          <w:p>
+            <w:r/>
+            <w:r>
+              <w:rPr>
+                <w:rFonts w:ascii="Arial" w:hAnsi="Arial" w:cs="Arial"/>
+                <w:b w:val="0"/>
+                <w:i w:val="0"/>
+                <w:color w:val="3A2A30"/>
+                <w:sz w:val="20"/>
+              </w:rPr>
+              <w:t>Entire storefront: Jinja templates, CSS, vanilla JS, mockups, Demo Day deck, live demo, CGV. Entire database: SQLAlchemy models, ERD, SQLite/PostgreSQL schema, seed (users, seven categories, photos), vitrine tables (shop_themes, theme_products, shop_vitrine).</w:t>
             </w:r>
           </w:p>
         </w:tc>
       </w:tr>
     </w:tbl>
     <w:p/>
+    <w:p>
+      <w:pPr>
+        <w:spacing w:after="160"/>
+      </w:pPr>
+      <w:r>
+        <w:rPr>
+          <w:rFonts w:ascii="Arial" w:hAnsi="Arial" w:cs="Arial"/>
+          <w:b/>
+          <w:i w:val="0"/>
+          <w:color w:val="3A2A30"/>
+          <w:sz w:val="22"/>
+        </w:rPr>
+        <w:t>Workload is 50 / 50. Dimitri does not own the database. Mattieu does not own the Flask API. The two halves meet at JSON: Mattieu’s pages call Dimitri’s routes; Dimitri’s services persist through Mattieu’s tables.</w:t>
+      </w:r>
+    </w:p>
     <w:p>
       <w:pPr>
         <w:spacing w:after="160"/>
@@ -430,7 +502,7 @@
           <w:color w:val="3A2A30"/>
           <w:sz w:val="22"/>
         </w:rPr>
-        <w:t>Small UI or copy decisions: Mattieu, then a screenshot on the PR.</w:t>
+        <w:t>UI and copy: Mattieu (frontend). Schema, models, seed: Mattieu (database).</w:t>
       </w:r>
     </w:p>
     <w:p>
@@ -446,7 +518,7 @@
           <w:color w:val="3A2A30"/>
           <w:sz w:val="22"/>
         </w:rPr>
-        <w:t>API, schema, security, money: Dimitri, with a test in the same PR.</w:t>
+        <w:t>API, auth, checkout, security, tests: Dimitri (backend), with a test in the same PR.</w:t>
       </w:r>
     </w:p>
     <w:p>
@@ -1126,7 +1198,7 @@
           <w:color w:val="3A2A30"/>
           <w:sz w:val="22"/>
         </w:rPr>
-        <w:t>Transactional email (receipts, verification, password reset) — pages exist as UI only.</w:t>
+        <w:t>Promotional email alerts for events — verification and password reset use a 6-digit code (SMTP optional).</w:t>
       </w:r>
     </w:p>
     <w:p>
@@ -1627,7 +1699,7 @@
                 <w:color w:val="3A2A30"/>
                 <w:sz w:val="20"/>
               </w:rPr>
-              <w:t>Dimitri owns money/auth; Mattieu owns demo UI. No single-person critical path without a fallback (tests + README).</w:t>
+              <w:t>50/50 split: Dimitri = all backend; Mattieu = all frontend + all database. Fallback = tests + README.</w:t>
             </w:r>
           </w:p>
         </w:tc>
@@ -9111,7 +9183,7 @@
                 <w:color w:val="3A2A30"/>
                 <w:sz w:val="20"/>
               </w:rPr>
-              <w:t>US-01..02 Auth</w:t>
+              <w:t>US-01..02 Auth API</w:t>
             </w:r>
           </w:p>
         </w:tc>
@@ -9183,7 +9255,7 @@
                 <w:color w:val="3A2A30"/>
                 <w:sz w:val="20"/>
               </w:rPr>
-              <w:t>backend, security</w:t>
+              <w:t>backend</w:t>
             </w:r>
           </w:p>
         </w:tc>
@@ -9204,7 +9276,7 @@
                 <w:color w:val="3A2A30"/>
                 <w:sz w:val="20"/>
               </w:rPr>
-              <w:t>US-03..05 Shop + cart</w:t>
+              <w:t>US-03..05 Shop + cart UI</w:t>
             </w:r>
           </w:p>
         </w:tc>
@@ -9300,7 +9372,7 @@
                 <w:color w:val="3A2A30"/>
                 <w:sz w:val="20"/>
               </w:rPr>
-              <w:t>US-06..07 Checkout + deposit</w:t>
+              <w:t>Catalog / orders tables</w:t>
             </w:r>
           </w:p>
         </w:tc>
@@ -9318,7 +9390,7 @@
                 <w:color w:val="3A2A30"/>
                 <w:sz w:val="20"/>
               </w:rPr>
-              <w:t>Story</w:t>
+              <w:t>Tech</w:t>
             </w:r>
           </w:p>
         </w:tc>
@@ -9336,7 +9408,7 @@
                 <w:color w:val="3A2A30"/>
                 <w:sz w:val="20"/>
               </w:rPr>
-              <w:t>Dimitri</w:t>
+              <w:t>Mattieu</w:t>
             </w:r>
           </w:p>
         </w:tc>
@@ -9372,7 +9444,7 @@
                 <w:color w:val="3A2A30"/>
                 <w:sz w:val="20"/>
               </w:rPr>
-              <w:t>backend, payments</w:t>
+              <w:t>database</w:t>
             </w:r>
           </w:p>
         </w:tc>
@@ -9393,7 +9465,7 @@
                 <w:color w:val="3A2A30"/>
                 <w:sz w:val="20"/>
               </w:rPr>
-              <w:t>US-08 Tracking page</w:t>
+              <w:t>US-06..07 Checkout API</w:t>
             </w:r>
           </w:p>
         </w:tc>
@@ -9431,7 +9503,7 @@
                 <w:color w:val="3A2A30"/>
                 <w:sz w:val="20"/>
               </w:rPr>
-              <w:t>Mattieu</w:t>
+              <w:t>Dimitri</w:t>
             </w:r>
           </w:p>
         </w:tc>
@@ -9450,7 +9522,7 @@
                 <w:color w:val="3A2A30"/>
                 <w:sz w:val="20"/>
               </w:rPr>
-              <w:t>Should</w:t>
+              <w:t>Must</w:t>
             </w:r>
           </w:p>
         </w:tc>
@@ -9469,7 +9541,7 @@
                 <w:color w:val="3A2A30"/>
                 <w:sz w:val="20"/>
               </w:rPr>
-              <w:t>frontend</w:t>
+              <w:t>backend</w:t>
             </w:r>
           </w:p>
         </w:tc>
@@ -9489,7 +9561,7 @@
                 <w:color w:val="3A2A30"/>
                 <w:sz w:val="20"/>
               </w:rPr>
-              <w:t>US-11..15 Admin catalog, vitrine, invoices</w:t>
+              <w:t>US-08 Tracking page</w:t>
             </w:r>
           </w:p>
         </w:tc>
@@ -9525,7 +9597,7 @@
                 <w:color w:val="3A2A30"/>
                 <w:sz w:val="20"/>
               </w:rPr>
-              <w:t>Both</w:t>
+              <w:t>Mattieu</w:t>
             </w:r>
           </w:p>
         </w:tc>
@@ -9543,7 +9615,7 @@
                 <w:color w:val="3A2A30"/>
                 <w:sz w:val="20"/>
               </w:rPr>
-              <w:t>Must</w:t>
+              <w:t>Should</w:t>
             </w:r>
           </w:p>
         </w:tc>
@@ -9561,7 +9633,7 @@
                 <w:color w:val="3A2A30"/>
                 <w:sz w:val="20"/>
               </w:rPr>
-              <w:t>fullstack</w:t>
+              <w:t>frontend</w:t>
             </w:r>
           </w:p>
         </w:tc>
@@ -9582,7 +9654,7 @@
                 <w:color w:val="3A2A30"/>
                 <w:sz w:val="20"/>
               </w:rPr>
-              <w:t>HTTPS / FORCE_HTTPS</w:t>
+              <w:t>US-11..15 Admin screens</w:t>
             </w:r>
           </w:p>
         </w:tc>
@@ -9601,7 +9673,7 @@
                 <w:color w:val="3A2A30"/>
                 <w:sz w:val="20"/>
               </w:rPr>
-              <w:t>Tech</w:t>
+              <w:t>Story</w:t>
             </w:r>
           </w:p>
         </w:tc>
@@ -9620,7 +9692,7 @@
                 <w:color w:val="3A2A30"/>
                 <w:sz w:val="20"/>
               </w:rPr>
-              <w:t>Dimitri</w:t>
+              <w:t>Mattieu</w:t>
             </w:r>
           </w:p>
         </w:tc>
@@ -9658,7 +9730,7 @@
                 <w:color w:val="3A2A30"/>
                 <w:sz w:val="20"/>
               </w:rPr>
-              <w:t>security</w:t>
+              <w:t>frontend</w:t>
             </w:r>
           </w:p>
         </w:tc>
@@ -9678,7 +9750,7 @@
                 <w:color w:val="3A2A30"/>
                 <w:sz w:val="20"/>
               </w:rPr>
-              <w:t>CNIL login lockout</w:t>
+              <w:t>US-11..15 Admin APIs</w:t>
             </w:r>
           </w:p>
         </w:tc>
@@ -9696,7 +9768,7 @@
                 <w:color w:val="3A2A30"/>
                 <w:sz w:val="20"/>
               </w:rPr>
-              <w:t>Tech</w:t>
+              <w:t>Story</w:t>
             </w:r>
           </w:p>
         </w:tc>
@@ -9750,7 +9822,7 @@
                 <w:color w:val="3A2A30"/>
                 <w:sz w:val="20"/>
               </w:rPr>
-              <w:t>security</w:t>
+              <w:t>backend</w:t>
             </w:r>
           </w:p>
         </w:tc>
@@ -9771,7 +9843,7 @@
                 <w:color w:val="3A2A30"/>
                 <w:sz w:val="20"/>
               </w:rPr>
-              <w:t>DB schema + seed</w:t>
+              <w:t>HTTPS / FORCE_HTTPS</w:t>
             </w:r>
           </w:p>
         </w:tc>
@@ -9847,7 +9919,7 @@
                 <w:color w:val="3A2A30"/>
                 <w:sz w:val="20"/>
               </w:rPr>
-              <w:t>database</w:t>
+              <w:t>backend</w:t>
             </w:r>
           </w:p>
         </w:tc>
@@ -9867,7 +9939,7 @@
                 <w:color w:val="3A2A30"/>
                 <w:sz w:val="20"/>
               </w:rPr>
-              <w:t>API + Swagger</w:t>
+              <w:t>CNIL login lockout</w:t>
             </w:r>
           </w:p>
         </w:tc>
@@ -9939,7 +10011,7 @@
                 <w:color w:val="3A2A30"/>
                 <w:sz w:val="20"/>
               </w:rPr>
-              <w:t>api</w:t>
+              <w:t>backend</w:t>
             </w:r>
           </w:p>
         </w:tc>
@@ -9960,7 +10032,7 @@
                 <w:color w:val="3A2A30"/>
                 <w:sz w:val="20"/>
               </w:rPr>
-              <w:t>Security review / tests</w:t>
+              <w:t>DB schema + seed</w:t>
             </w:r>
           </w:p>
         </w:tc>
@@ -9998,7 +10070,7 @@
                 <w:color w:val="3A2A30"/>
                 <w:sz w:val="20"/>
               </w:rPr>
-              <w:t>Dimitri</w:t>
+              <w:t>Mattieu</w:t>
             </w:r>
           </w:p>
         </w:tc>
@@ -10036,7 +10108,7 @@
                 <w:color w:val="3A2A30"/>
                 <w:sz w:val="20"/>
               </w:rPr>
-              <w:t>security, test</w:t>
+              <w:t>database</w:t>
             </w:r>
           </w:p>
         </w:tc>
@@ -10056,7 +10128,7 @@
                 <w:color w:val="3A2A30"/>
                 <w:sz w:val="20"/>
               </w:rPr>
-              <w:t>Deck + demo story</w:t>
+              <w:t>API + Swagger</w:t>
             </w:r>
           </w:p>
         </w:tc>
@@ -10092,7 +10164,7 @@
                 <w:color w:val="3A2A30"/>
                 <w:sz w:val="20"/>
               </w:rPr>
-              <w:t>Mattieu</w:t>
+              <w:t>Dimitri</w:t>
             </w:r>
           </w:p>
         </w:tc>
@@ -10128,7 +10200,7 @@
                 <w:color w:val="3A2A30"/>
                 <w:sz w:val="20"/>
               </w:rPr>
-              <w:t>docs, demo</w:t>
+              <w:t>backend</w:t>
             </w:r>
           </w:p>
         </w:tc>
@@ -10149,7 +10221,7 @@
                 <w:color w:val="3A2A30"/>
                 <w:sz w:val="20"/>
               </w:rPr>
-              <w:t>README + specs</w:t>
+              <w:t>API tests</w:t>
             </w:r>
           </w:p>
         </w:tc>
@@ -10187,7 +10259,7 @@
                 <w:color w:val="3A2A30"/>
                 <w:sz w:val="20"/>
               </w:rPr>
-              <w:t>Both</w:t>
+              <w:t>Dimitri</w:t>
             </w:r>
           </w:p>
         </w:tc>
@@ -10225,7 +10297,7 @@
                 <w:color w:val="3A2A30"/>
                 <w:sz w:val="20"/>
               </w:rPr>
-              <w:t>docs</w:t>
+              <w:t>backend</w:t>
             </w:r>
           </w:p>
         </w:tc>
@@ -10245,7 +10317,7 @@
                 <w:color w:val="3A2A30"/>
                 <w:sz w:val="20"/>
               </w:rPr>
-              <w:t>Email / SMS verification</w:t>
+              <w:t>Deck + demo + mockups</w:t>
             </w:r>
           </w:p>
         </w:tc>
@@ -10263,7 +10335,7 @@
                 <w:color w:val="3A2A30"/>
                 <w:sz w:val="20"/>
               </w:rPr>
-              <w:t>Story</w:t>
+              <w:t>Tech</w:t>
             </w:r>
           </w:p>
         </w:tc>
@@ -10281,7 +10353,7 @@
                 <w:color w:val="3A2A30"/>
                 <w:sz w:val="20"/>
               </w:rPr>
-              <w:t>Dimitri</w:t>
+              <w:t>Mattieu</w:t>
             </w:r>
           </w:p>
         </w:tc>
@@ -10317,7 +10389,7 @@
                 <w:color w:val="3A2A30"/>
                 <w:sz w:val="20"/>
               </w:rPr>
-              <w:t>Done</w:t>
+              <w:t>frontend</w:t>
             </w:r>
           </w:p>
         </w:tc>
@@ -10338,7 +10410,7 @@
                 <w:color w:val="3A2A30"/>
                 <w:sz w:val="20"/>
               </w:rPr>
-              <w:t>Customer password change</w:t>
+              <w:t>Email / SMS verify API</w:t>
             </w:r>
           </w:p>
         </w:tc>
@@ -10414,7 +10486,196 @@
                 <w:color w:val="3A2A30"/>
                 <w:sz w:val="20"/>
               </w:rPr>
-              <w:t>Done</w:t>
+              <w:t>backend</w:t>
+            </w:r>
+          </w:p>
+        </w:tc>
+      </w:tr>
+      <w:tr>
+        <w:tc>
+          <w:tcPr>
+            <w:tcW w:type="dxa" w:w="1994"/>
+          </w:tcPr>
+          <w:p>
+            <w:r/>
+            <w:r>
+              <w:rPr>
+                <w:rFonts w:ascii="Arial" w:hAnsi="Arial" w:cs="Arial"/>
+                <w:b w:val="0"/>
+                <w:i w:val="0"/>
+                <w:color w:val="3A2A30"/>
+                <w:sz w:val="20"/>
+              </w:rPr>
+              <w:t>Password-change API</w:t>
+            </w:r>
+          </w:p>
+        </w:tc>
+        <w:tc>
+          <w:tcPr>
+            <w:tcW w:type="dxa" w:w="1994"/>
+          </w:tcPr>
+          <w:p>
+            <w:r/>
+            <w:r>
+              <w:rPr>
+                <w:rFonts w:ascii="Arial" w:hAnsi="Arial" w:cs="Arial"/>
+                <w:b w:val="0"/>
+                <w:i w:val="0"/>
+                <w:color w:val="3A2A30"/>
+                <w:sz w:val="20"/>
+              </w:rPr>
+              <w:t>Story</w:t>
+            </w:r>
+          </w:p>
+        </w:tc>
+        <w:tc>
+          <w:tcPr>
+            <w:tcW w:type="dxa" w:w="1994"/>
+          </w:tcPr>
+          <w:p>
+            <w:r/>
+            <w:r>
+              <w:rPr>
+                <w:rFonts w:ascii="Arial" w:hAnsi="Arial" w:cs="Arial"/>
+                <w:b w:val="0"/>
+                <w:i w:val="0"/>
+                <w:color w:val="3A2A30"/>
+                <w:sz w:val="20"/>
+              </w:rPr>
+              <w:t>Dimitri</w:t>
+            </w:r>
+          </w:p>
+        </w:tc>
+        <w:tc>
+          <w:tcPr>
+            <w:tcW w:type="dxa" w:w="1994"/>
+          </w:tcPr>
+          <w:p>
+            <w:r/>
+            <w:r>
+              <w:rPr>
+                <w:rFonts w:ascii="Arial" w:hAnsi="Arial" w:cs="Arial"/>
+                <w:b w:val="0"/>
+                <w:i w:val="0"/>
+                <w:color w:val="3A2A30"/>
+                <w:sz w:val="20"/>
+              </w:rPr>
+              <w:t>Must</w:t>
+            </w:r>
+          </w:p>
+        </w:tc>
+        <w:tc>
+          <w:tcPr>
+            <w:tcW w:type="dxa" w:w="1994"/>
+          </w:tcPr>
+          <w:p>
+            <w:r/>
+            <w:r>
+              <w:rPr>
+                <w:rFonts w:ascii="Arial" w:hAnsi="Arial" w:cs="Arial"/>
+                <w:b w:val="0"/>
+                <w:i w:val="0"/>
+                <w:color w:val="3A2A30"/>
+                <w:sz w:val="20"/>
+              </w:rPr>
+              <w:t>backend</w:t>
+            </w:r>
+          </w:p>
+        </w:tc>
+      </w:tr>
+      <w:tr>
+        <w:tc>
+          <w:tcPr>
+            <w:tcW w:type="dxa" w:w="1994"/>
+            <w:shd w:fill="F8F5F2" w:val="clear"/>
+          </w:tcPr>
+          <w:p>
+            <w:r/>
+            <w:r>
+              <w:rPr>
+                <w:rFonts w:ascii="Arial" w:hAnsi="Arial" w:cs="Arial"/>
+                <w:b w:val="0"/>
+                <w:i w:val="0"/>
+                <w:color w:val="3A2A30"/>
+                <w:sz w:val="20"/>
+              </w:rPr>
+              <w:t>Password / verify pages</w:t>
+            </w:r>
+          </w:p>
+        </w:tc>
+        <w:tc>
+          <w:tcPr>
+            <w:tcW w:type="dxa" w:w="1994"/>
+            <w:shd w:fill="F8F5F2" w:val="clear"/>
+          </w:tcPr>
+          <w:p>
+            <w:r/>
+            <w:r>
+              <w:rPr>
+                <w:rFonts w:ascii="Arial" w:hAnsi="Arial" w:cs="Arial"/>
+                <w:b w:val="0"/>
+                <w:i w:val="0"/>
+                <w:color w:val="3A2A30"/>
+                <w:sz w:val="20"/>
+              </w:rPr>
+              <w:t>Story</w:t>
+            </w:r>
+          </w:p>
+        </w:tc>
+        <w:tc>
+          <w:tcPr>
+            <w:tcW w:type="dxa" w:w="1994"/>
+            <w:shd w:fill="F8F5F2" w:val="clear"/>
+          </w:tcPr>
+          <w:p>
+            <w:r/>
+            <w:r>
+              <w:rPr>
+                <w:rFonts w:ascii="Arial" w:hAnsi="Arial" w:cs="Arial"/>
+                <w:b w:val="0"/>
+                <w:i w:val="0"/>
+                <w:color w:val="3A2A30"/>
+                <w:sz w:val="20"/>
+              </w:rPr>
+              <w:t>Mattieu</w:t>
+            </w:r>
+          </w:p>
+        </w:tc>
+        <w:tc>
+          <w:tcPr>
+            <w:tcW w:type="dxa" w:w="1994"/>
+            <w:shd w:fill="F8F5F2" w:val="clear"/>
+          </w:tcPr>
+          <w:p>
+            <w:r/>
+            <w:r>
+              <w:rPr>
+                <w:rFonts w:ascii="Arial" w:hAnsi="Arial" w:cs="Arial"/>
+                <w:b w:val="0"/>
+                <w:i w:val="0"/>
+                <w:color w:val="3A2A30"/>
+                <w:sz w:val="20"/>
+              </w:rPr>
+              <w:t>Must</w:t>
+            </w:r>
+          </w:p>
+        </w:tc>
+        <w:tc>
+          <w:tcPr>
+            <w:tcW w:type="dxa" w:w="1994"/>
+            <w:shd w:fill="F8F5F2" w:val="clear"/>
+          </w:tcPr>
+          <w:p>
+            <w:r/>
+            <w:r>
+              <w:rPr>
+                <w:rFonts w:ascii="Arial" w:hAnsi="Arial" w:cs="Arial"/>
+                <w:b w:val="0"/>
+                <w:i w:val="0"/>
+                <w:color w:val="3A2A30"/>
+                <w:sz w:val="20"/>
+              </w:rPr>
+              <w:t>frontend</w:t>
             </w:r>
           </w:p>
         </w:tc>
@@ -10433,7 +10694,7 @@
           <w:color w:val="3A2A30"/>
           <w:sz w:val="22"/>
         </w:rPr>
-        <w:t>Deadlines: MVP purchase path first; vitrine and invoices before Demo Day; leftovers (email, geo) explicitly Won’t Have. Workload: Dimitri heavier on tests/API; Mattieu heavier on UI/demo speaking time.</w:t>
+        <w:t>Deadlines: MVP purchase path first; vitrine and invoices before Demo Day; leftovers (geo, HT/TVA) explicitly Won’t Have. Workload: 50 % Dimitri (backend only) / 50 % Mattieu (frontend + database).</w:t>
       </w:r>
     </w:p>
     <w:p>

</xml_diff>